<commit_message>
docs: integrate system architecture diagram and pipeline layout to README
</commit_message>
<xml_diff>
--- a/secure_clinical_insights_engine_blueprint.docx
+++ b/secure_clinical_insights_engine_blueprint.docx
@@ -33718,11 +33718,547 @@
       <w:pPr>
         <w:rPr>
           <w:rFonts w:hint="default"/>
+          <w:b/>
+          <w:bCs/>
+          <w:sz w:val="24"/>
+          <w:szCs w:val="24"/>
           <w:lang w:val="en-US"/>
+        </w:rPr>
+      </w:pPr>
+      <w:r>
+        <w:rPr>
+          <w:rFonts w:hint="default"/>
+          <w:b/>
+          <w:bCs/>
+          <w:sz w:val="24"/>
+          <w:szCs w:val="24"/>
+          <w:lang w:val="en-US"/>
+        </w:rPr>
+        <w:t>How we are working on part where it will not give any suggestion to doctor like which medicine to prescribe</w:t>
+      </w:r>
+    </w:p>
+    <w:p>
+      <w:r>
+        <w:drawing>
+          <wp:inline distT="0" distB="0" distL="114300" distR="114300">
+            <wp:extent cx="6276975" cy="2771775"/>
+            <wp:effectExtent l="0" t="0" r="9525" b="9525"/>
+            <wp:docPr id="11" name="Picture 18"/>
+            <wp:cNvGraphicFramePr>
+              <a:graphicFrameLocks xmlns:a="http://schemas.openxmlformats.org/drawingml/2006/main" noChangeAspect="1"/>
+            </wp:cNvGraphicFramePr>
+            <a:graphic xmlns:a="http://schemas.openxmlformats.org/drawingml/2006/main">
+              <a:graphicData uri="http://schemas.openxmlformats.org/drawingml/2006/picture">
+                <pic:pic xmlns:pic="http://schemas.openxmlformats.org/drawingml/2006/picture">
+                  <pic:nvPicPr>
+                    <pic:cNvPr id="11" name="Picture 18"/>
+                    <pic:cNvPicPr>
+                      <a:picLocks noChangeAspect="1"/>
+                    </pic:cNvPicPr>
+                  </pic:nvPicPr>
+                  <pic:blipFill>
+                    <a:blip r:embed="rId16"/>
+                    <a:stretch>
+                      <a:fillRect/>
+                    </a:stretch>
+                  </pic:blipFill>
+                  <pic:spPr>
+                    <a:xfrm>
+                      <a:off x="0" y="0"/>
+                      <a:ext cx="6276975" cy="2771775"/>
+                    </a:xfrm>
+                    <a:prstGeom prst="rect">
+                      <a:avLst/>
+                    </a:prstGeom>
+                    <a:noFill/>
+                    <a:ln>
+                      <a:noFill/>
+                    </a:ln>
+                  </pic:spPr>
+                </pic:pic>
+              </a:graphicData>
+            </a:graphic>
+          </wp:inline>
+        </w:drawing>
+      </w:r>
+    </w:p>
+    <w:p/>
+    <w:p>
+      <w:pPr>
+        <w:keepNext w:val="0"/>
+        <w:keepLines w:val="0"/>
+        <w:widowControl/>
+        <w:suppressLineNumbers w:val="0"/>
+        <w:pBdr>
+          <w:bottom w:val="none" w:color="E6E8F0" w:sz="0" w:space="0"/>
+        </w:pBdr>
+        <w:spacing w:before="180" w:beforeAutospacing="0" w:after="240" w:afterAutospacing="0"/>
+        <w:ind w:left="0" w:right="0"/>
+        <w:jc w:val="left"/>
+        <w:rPr>
+          <w:rFonts w:ascii="Arial" w:hAnsi="Arial" w:eastAsia="Arial" w:cs="Arial"/>
+          <w:sz w:val="24"/>
+          <w:szCs w:val="24"/>
+          <w:u w:val="none"/>
+        </w:rPr>
+      </w:pPr>
+      <w:r>
+        <w:rPr>
+          <w:rStyle w:val="36"/>
+          <w:rFonts w:hint="default" w:ascii="Arial" w:hAnsi="Arial" w:eastAsia="Arial" w:cs="Arial"/>
+          <w:color w:val="374151"/>
+          <w:kern w:val="0"/>
+          <w:sz w:val="24"/>
+          <w:szCs w:val="24"/>
+          <w:u w:val="none"/>
+          <w:lang w:val="en-US" w:eastAsia="zh-CN" w:bidi="ar"/>
+        </w:rPr>
+        <w:t>When you resume tomorrow, you should start the instance from this exact screen in the AWS Console.</w:t>
+      </w:r>
+    </w:p>
+    <w:p>
+      <w:pPr>
+        <w:keepNext w:val="0"/>
+        <w:keepLines w:val="0"/>
+        <w:widowControl/>
+        <w:suppressLineNumbers w:val="0"/>
+        <w:pBdr>
+          <w:bottom w:val="none" w:color="E6E8F0" w:sz="0" w:space="0"/>
+        </w:pBdr>
+        <w:spacing w:before="180" w:beforeAutospacing="0" w:after="240" w:afterAutospacing="0"/>
+        <w:ind w:left="0" w:right="0"/>
+        <w:jc w:val="left"/>
+        <w:rPr>
+          <w:rFonts w:hint="default" w:ascii="Arial" w:hAnsi="Arial" w:eastAsia="Arial" w:cs="Arial"/>
+          <w:sz w:val="24"/>
+          <w:szCs w:val="24"/>
+          <w:u w:val="none"/>
+        </w:rPr>
+      </w:pPr>
+      <w:r>
+        <w:rPr>
+          <w:rFonts w:hint="default" w:ascii="Arial" w:hAnsi="Arial" w:eastAsia="Arial" w:cs="Arial"/>
+          <w:color w:val="374151"/>
+          <w:kern w:val="0"/>
+          <w:sz w:val="24"/>
+          <w:szCs w:val="24"/>
+          <w:u w:val="none"/>
+          <w:lang w:val="en-US" w:eastAsia="zh-CN" w:bidi="ar"/>
+        </w:rPr>
+        <w:t>You will follow the same pattern you used to stop it:</w:t>
+      </w:r>
+    </w:p>
+    <w:p>
+      <w:pPr>
+        <w:keepNext w:val="0"/>
+        <w:keepLines w:val="0"/>
+        <w:widowControl/>
+        <w:numPr>
+          <w:ilvl w:val="0"/>
+          <w:numId w:val="11"/>
+        </w:numPr>
+        <w:suppressLineNumbers w:val="0"/>
+        <w:pBdr>
+          <w:bottom w:val="none" w:color="E6E8F0" w:sz="0" w:space="0"/>
+        </w:pBdr>
+        <w:spacing w:before="0" w:beforeAutospacing="0" w:after="180" w:afterAutospacing="0"/>
+        <w:ind w:left="0" w:right="0" w:hanging="360"/>
+        <w:rPr>
+          <w:rFonts w:hint="default" w:ascii="Arial" w:hAnsi="Arial" w:eastAsia="Arial" w:cs="Arial"/>
+          <w:sz w:val="24"/>
+          <w:szCs w:val="24"/>
+          <w:u w:val="none"/>
+        </w:rPr>
+      </w:pPr>
+      <w:r>
+        <w:rPr>
+          <w:rFonts w:hint="default" w:ascii="Arial" w:hAnsi="Arial" w:eastAsia="Arial" w:cs="Arial"/>
+          <w:sz w:val="24"/>
+          <w:szCs w:val="24"/>
+          <w:u w:val="none"/>
+        </w:rPr>
+        <w:t xml:space="preserve">Open this </w:t>
+      </w:r>
+      <w:r>
+        <w:rPr>
+          <w:rStyle w:val="36"/>
+          <w:rFonts w:hint="default" w:ascii="Arial" w:hAnsi="Arial" w:eastAsia="Arial" w:cs="Arial"/>
+          <w:b/>
+          <w:bCs/>
+          <w:sz w:val="24"/>
+          <w:szCs w:val="24"/>
+          <w:u w:val="none"/>
+        </w:rPr>
+        <w:t>Instances</w:t>
+      </w:r>
+      <w:r>
+        <w:rPr>
+          <w:rFonts w:hint="default" w:ascii="Arial" w:hAnsi="Arial" w:eastAsia="Arial" w:cs="Arial"/>
+          <w:sz w:val="24"/>
+          <w:szCs w:val="24"/>
+          <w:u w:val="none"/>
+        </w:rPr>
+        <w:t xml:space="preserve"> dashboard view in your AWS management console.</w:t>
+      </w:r>
+    </w:p>
+    <w:p>
+      <w:pPr>
+        <w:keepNext w:val="0"/>
+        <w:keepLines w:val="0"/>
+        <w:widowControl/>
+        <w:numPr>
+          <w:ilvl w:val="0"/>
+          <w:numId w:val="11"/>
+        </w:numPr>
+        <w:suppressLineNumbers w:val="0"/>
+        <w:pBdr>
+          <w:bottom w:val="none" w:color="E6E8F0" w:sz="0" w:space="0"/>
+        </w:pBdr>
+        <w:spacing w:before="0" w:beforeAutospacing="0" w:after="180" w:afterAutospacing="0"/>
+        <w:ind w:left="0" w:right="0" w:hanging="360"/>
+        <w:rPr>
+          <w:rFonts w:hint="default" w:ascii="Arial" w:hAnsi="Arial" w:eastAsia="Arial" w:cs="Arial"/>
+          <w:sz w:val="24"/>
+          <w:szCs w:val="24"/>
+          <w:u w:val="none"/>
+        </w:rPr>
+      </w:pPr>
+      <w:r>
+        <w:rPr>
+          <w:rFonts w:hint="default" w:ascii="Arial" w:hAnsi="Arial" w:eastAsia="Arial" w:cs="Arial"/>
+          <w:sz w:val="24"/>
+          <w:szCs w:val="24"/>
+          <w:u w:val="none"/>
+        </w:rPr>
+        <w:t xml:space="preserve">Check the box next to your instance named </w:t>
+      </w:r>
+      <w:r>
+        <w:rPr>
+          <w:rStyle w:val="20"/>
+          <w:rFonts w:ascii="monospace" w:hAnsi="monospace" w:eastAsia="monospace" w:cs="monospace"/>
+          <w:b/>
+          <w:bCs/>
+          <w:sz w:val="21"/>
+          <w:szCs w:val="21"/>
+          <w:u w:val="none"/>
+        </w:rPr>
+        <w:t>clinical-FDE-data</w:t>
+      </w:r>
+      <w:r>
+        <w:rPr>
+          <w:rFonts w:hint="default" w:ascii="Arial" w:hAnsi="Arial" w:eastAsia="Arial" w:cs="Arial"/>
+          <w:sz w:val="24"/>
+          <w:szCs w:val="24"/>
+          <w:u w:val="none"/>
+        </w:rPr>
+        <w:t>.</w:t>
+      </w:r>
+    </w:p>
+    <w:p>
+      <w:pPr>
+        <w:keepNext w:val="0"/>
+        <w:keepLines w:val="0"/>
+        <w:widowControl/>
+        <w:numPr>
+          <w:ilvl w:val="0"/>
+          <w:numId w:val="11"/>
+        </w:numPr>
+        <w:suppressLineNumbers w:val="0"/>
+        <w:pBdr>
+          <w:bottom w:val="none" w:color="E6E8F0" w:sz="0" w:space="0"/>
+        </w:pBdr>
+        <w:spacing w:before="0" w:beforeAutospacing="0" w:after="180" w:afterAutospacing="0"/>
+        <w:ind w:left="0" w:right="0" w:hanging="360"/>
+        <w:rPr>
+          <w:rFonts w:hint="default" w:ascii="Arial" w:hAnsi="Arial" w:eastAsia="Arial" w:cs="Arial"/>
+          <w:sz w:val="24"/>
+          <w:szCs w:val="24"/>
+          <w:u w:val="none"/>
+        </w:rPr>
+      </w:pPr>
+      <w:r>
+        <w:rPr>
+          <w:rFonts w:hint="default" w:ascii="Arial" w:hAnsi="Arial" w:eastAsia="Arial" w:cs="Arial"/>
+          <w:sz w:val="24"/>
+          <w:szCs w:val="24"/>
+          <w:u w:val="none"/>
+        </w:rPr>
+        <w:t xml:space="preserve">Click the </w:t>
+      </w:r>
+      <w:r>
+        <w:rPr>
+          <w:rStyle w:val="36"/>
+          <w:rFonts w:hint="default" w:ascii="Arial" w:hAnsi="Arial" w:eastAsia="Arial" w:cs="Arial"/>
+          <w:b/>
+          <w:bCs/>
+          <w:sz w:val="24"/>
+          <w:szCs w:val="24"/>
+          <w:u w:val="none"/>
+        </w:rPr>
+        <w:t>Instance state</w:t>
+      </w:r>
+      <w:r>
+        <w:rPr>
+          <w:rFonts w:hint="default" w:ascii="Arial" w:hAnsi="Arial" w:eastAsia="Arial" w:cs="Arial"/>
+          <w:sz w:val="24"/>
+          <w:szCs w:val="24"/>
+          <w:u w:val="none"/>
+        </w:rPr>
+        <w:t xml:space="preserve"> dropdown menu button at the top.</w:t>
+      </w:r>
+    </w:p>
+    <w:p>
+      <w:pPr>
+        <w:keepNext w:val="0"/>
+        <w:keepLines w:val="0"/>
+        <w:widowControl/>
+        <w:numPr>
+          <w:ilvl w:val="0"/>
+          <w:numId w:val="11"/>
+        </w:numPr>
+        <w:suppressLineNumbers w:val="0"/>
+        <w:pBdr>
+          <w:bottom w:val="none" w:color="E6E8F0" w:sz="0" w:space="0"/>
+        </w:pBdr>
+        <w:spacing w:before="0" w:beforeAutospacing="0" w:after="180" w:afterAutospacing="0"/>
+        <w:ind w:left="0" w:right="0" w:hanging="360"/>
+        <w:rPr>
+          <w:rFonts w:hint="default" w:ascii="Arial" w:hAnsi="Arial" w:eastAsia="Arial" w:cs="Arial"/>
+          <w:sz w:val="24"/>
+          <w:szCs w:val="24"/>
+          <w:u w:val="none"/>
+        </w:rPr>
+      </w:pPr>
+      <w:r>
+        <w:rPr>
+          <w:rFonts w:hint="default" w:ascii="Arial" w:hAnsi="Arial" w:eastAsia="Arial" w:cs="Arial"/>
+          <w:sz w:val="24"/>
+          <w:szCs w:val="24"/>
+          <w:u w:val="none"/>
+        </w:rPr>
+        <w:t xml:space="preserve">Select </w:t>
+      </w:r>
+      <w:r>
+        <w:rPr>
+          <w:rStyle w:val="36"/>
+          <w:rFonts w:hint="default" w:ascii="Arial" w:hAnsi="Arial" w:eastAsia="Arial" w:cs="Arial"/>
+          <w:b/>
+          <w:bCs/>
+          <w:sz w:val="24"/>
+          <w:szCs w:val="24"/>
+          <w:u w:val="none"/>
+        </w:rPr>
+        <w:t>Start instance</w:t>
+      </w:r>
+      <w:r>
+        <w:rPr>
+          <w:rFonts w:hint="default" w:ascii="Arial" w:hAnsi="Arial" w:eastAsia="Arial" w:cs="Arial"/>
+          <w:sz w:val="24"/>
+          <w:szCs w:val="24"/>
+          <w:u w:val="none"/>
+        </w:rPr>
+        <w:t>.</w:t>
+      </w:r>
+    </w:p>
+    <w:p>
+      <w:pPr>
+        <w:keepNext w:val="0"/>
+        <w:keepLines w:val="0"/>
+        <w:widowControl/>
+        <w:numPr>
+          <w:numId w:val="0"/>
+        </w:numPr>
+        <w:suppressLineNumbers w:val="0"/>
+        <w:pBdr>
+          <w:bottom w:val="none" w:color="E6E8F0" w:sz="0" w:space="0"/>
+        </w:pBdr>
+        <w:spacing w:before="0" w:beforeAutospacing="0" w:after="180" w:afterAutospacing="0"/>
+        <w:ind w:left="-360" w:leftChars="0" w:right="0" w:rightChars="0"/>
+        <w:rPr>
+          <w:rFonts w:hint="default" w:ascii="Arial" w:hAnsi="Arial" w:eastAsia="Arial" w:cs="Arial"/>
+          <w:sz w:val="24"/>
+          <w:szCs w:val="24"/>
+          <w:u w:val="none"/>
+        </w:rPr>
+      </w:pPr>
+      <w:r>
+        <w:rPr>
+          <w:rFonts w:hint="default" w:ascii="Arial" w:hAnsi="Arial" w:eastAsia="Arial" w:cs="Arial"/>
+          <w:sz w:val="24"/>
+          <w:szCs w:val="24"/>
+          <w:u w:val="none"/>
+          <w:lang w:val="en-US"/>
+        </w:rPr>
+        <w:t xml:space="preserve">Activate virtual env : </w:t>
+      </w:r>
+      <w:r>
+        <w:rPr>
+          <w:rFonts w:hint="default" w:ascii="Arial" w:hAnsi="Arial" w:eastAsia="Arial" w:cs="Arial"/>
+          <w:sz w:val="24"/>
+          <w:szCs w:val="24"/>
+          <w:u w:val="none"/>
+        </w:rPr>
+        <w:t>clinicenv\Scripts\activate</w:t>
+      </w:r>
+    </w:p>
+    <w:p>
+      <w:pPr>
+        <w:keepNext w:val="0"/>
+        <w:keepLines w:val="0"/>
+        <w:widowControl/>
+        <w:numPr>
+          <w:numId w:val="0"/>
+        </w:numPr>
+        <w:suppressLineNumbers w:val="0"/>
+        <w:pBdr>
+          <w:bottom w:val="none" w:color="E6E8F0" w:sz="0" w:space="0"/>
+        </w:pBdr>
+        <w:spacing w:before="0" w:beforeAutospacing="0" w:after="180" w:afterAutospacing="0"/>
+        <w:ind w:left="-360" w:leftChars="0" w:right="0" w:rightChars="0"/>
+        <w:rPr>
+          <w:rFonts w:hint="default" w:ascii="Arial" w:hAnsi="Arial" w:eastAsia="Arial" w:cs="Arial"/>
+          <w:sz w:val="24"/>
+          <w:szCs w:val="24"/>
+          <w:u w:val="none"/>
+          <w:lang w:val="en-US"/>
+        </w:rPr>
+      </w:pPr>
+      <w:r>
+        <w:rPr>
+          <w:rFonts w:hint="default" w:ascii="Arial" w:hAnsi="Arial" w:eastAsia="Arial" w:cs="Arial"/>
+          <w:sz w:val="24"/>
+          <w:szCs w:val="24"/>
+          <w:u w:val="none"/>
+          <w:lang w:val="en-US"/>
+        </w:rPr>
+        <w:t xml:space="preserve">Connect to ubuntu : ssh -o ServerAliveInterval=60 -i clinical.pem </w:t>
+      </w:r>
+      <w:r>
+        <w:rPr>
+          <w:rFonts w:hint="default" w:ascii="Arial" w:hAnsi="Arial" w:eastAsia="Arial" w:cs="Arial"/>
+          <w:sz w:val="24"/>
+          <w:szCs w:val="24"/>
+          <w:u w:val="none"/>
+          <w:lang w:val="en-US"/>
+        </w:rPr>
+        <w:fldChar w:fldCharType="begin"/>
+      </w:r>
+      <w:r>
+        <w:rPr>
+          <w:rFonts w:hint="default" w:ascii="Arial" w:hAnsi="Arial" w:eastAsia="Arial" w:cs="Arial"/>
+          <w:sz w:val="24"/>
+          <w:szCs w:val="24"/>
+          <w:u w:val="none"/>
+          <w:lang w:val="en-US"/>
+        </w:rPr>
+        <w:instrText xml:space="preserve"> HYPERLINK "mailto:ubuntu@3.7.80.38" </w:instrText>
+      </w:r>
+      <w:r>
+        <w:rPr>
+          <w:rFonts w:hint="default" w:ascii="Arial" w:hAnsi="Arial" w:eastAsia="Arial" w:cs="Arial"/>
+          <w:sz w:val="24"/>
+          <w:szCs w:val="24"/>
+          <w:u w:val="none"/>
+          <w:lang w:val="en-US"/>
+        </w:rPr>
+        <w:fldChar w:fldCharType="separate"/>
+      </w:r>
+      <w:r>
+        <w:rPr>
+          <w:rFonts w:hint="default" w:ascii="Arial" w:hAnsi="Arial" w:eastAsia="Arial" w:cs="Arial"/>
+          <w:sz w:val="24"/>
+          <w:szCs w:val="24"/>
+          <w:u w:val="none"/>
+          <w:lang w:val="en-US"/>
+        </w:rPr>
+        <w:t>ubuntu@3.7.80.38</w:t>
+      </w:r>
+      <w:r>
+        <w:rPr>
+          <w:rFonts w:hint="default" w:ascii="Arial" w:hAnsi="Arial" w:eastAsia="Arial" w:cs="Arial"/>
+          <w:sz w:val="24"/>
+          <w:szCs w:val="24"/>
+          <w:u w:val="none"/>
+          <w:lang w:val="en-US"/>
+        </w:rPr>
+        <w:fldChar w:fldCharType="end"/>
+      </w:r>
+    </w:p>
+    <w:p>
+      <w:pPr>
+        <w:keepNext w:val="0"/>
+        <w:keepLines w:val="0"/>
+        <w:widowControl/>
+        <w:numPr>
+          <w:numId w:val="0"/>
+        </w:numPr>
+        <w:suppressLineNumbers w:val="0"/>
+        <w:pBdr>
+          <w:bottom w:val="none" w:color="E6E8F0" w:sz="0" w:space="0"/>
+        </w:pBdr>
+        <w:spacing w:before="0" w:beforeAutospacing="0" w:after="180" w:afterAutospacing="0"/>
+        <w:ind w:left="-360" w:leftChars="0" w:right="0" w:rightChars="0"/>
+        <w:rPr>
+          <w:rFonts w:hint="default" w:ascii="Arial" w:hAnsi="Arial" w:eastAsia="Arial" w:cs="Arial"/>
+          <w:sz w:val="24"/>
+          <w:szCs w:val="24"/>
+          <w:u w:val="none"/>
+          <w:lang w:val="en-US"/>
+        </w:rPr>
+      </w:pPr>
+      <w:r>
+        <w:rPr>
+          <w:rFonts w:hint="default" w:ascii="Arial" w:hAnsi="Arial" w:eastAsia="Arial" w:cs="Arial"/>
+          <w:sz w:val="24"/>
+          <w:szCs w:val="24"/>
+          <w:u w:val="none"/>
+          <w:lang w:val="en-US"/>
+        </w:rPr>
+        <w:t xml:space="preserve">Or </w:t>
+      </w:r>
+      <w:r>
+        <w:rPr>
+          <w:rFonts w:hint="default" w:ascii="Arial" w:hAnsi="Arial" w:eastAsia="Arial" w:cs="Arial"/>
+          <w:sz w:val="24"/>
+          <w:szCs w:val="24"/>
+          <w:u w:val="none"/>
+        </w:rPr>
+        <w:t>ssh -i clinical.pem ubuntu@3.7.80.38</w:t>
+      </w:r>
+    </w:p>
+    <w:p>
+      <w:pPr>
+        <w:keepNext w:val="0"/>
+        <w:keepLines w:val="0"/>
+        <w:widowControl/>
+        <w:numPr>
+          <w:numId w:val="0"/>
+        </w:numPr>
+        <w:suppressLineNumbers w:val="0"/>
+        <w:pBdr>
+          <w:bottom w:val="none" w:color="E6E8F0" w:sz="0" w:space="0"/>
+        </w:pBdr>
+        <w:spacing w:before="0" w:beforeAutospacing="0" w:after="180" w:afterAutospacing="0"/>
+        <w:ind w:left="-360" w:leftChars="0" w:right="0" w:rightChars="0"/>
+        <w:rPr>
+          <w:rFonts w:hint="default" w:ascii="Arial" w:hAnsi="Arial" w:eastAsia="Arial" w:cs="Arial"/>
+          <w:sz w:val="24"/>
+          <w:szCs w:val="24"/>
+          <w:u w:val="none"/>
         </w:rPr>
       </w:pPr>
       <w:bookmarkStart w:id="0" w:name="_GoBack"/>
       <w:bookmarkEnd w:id="0"/>
+    </w:p>
+    <w:p>
+      <w:pPr>
+        <w:rPr>
+          <w:rFonts w:hint="default" w:ascii="SimSun" w:hAnsi="SimSun" w:eastAsia="SimSun" w:cs="SimSun"/>
+          <w:sz w:val="24"/>
+          <w:szCs w:val="24"/>
+          <w:lang w:val="en-US"/>
+        </w:rPr>
+      </w:pPr>
     </w:p>
     <w:sectPr>
       <w:pgSz w:w="12240" w:h="15840"/>
@@ -33787,6 +34323,155 @@
 <file path=word/numbering.xml><?xml version="1.0" encoding="utf-8"?>
 <w:numbering xmlns:wpc="http://schemas.microsoft.com/office/word/2010/wordprocessingCanvas" xmlns:mc="http://schemas.openxmlformats.org/markup-compatibility/2006" xmlns:o="urn:schemas-microsoft-com:office:office" xmlns:r="http://schemas.openxmlformats.org/officeDocument/2006/relationships" xmlns:m="http://schemas.openxmlformats.org/officeDocument/2006/math" xmlns:v="urn:schemas-microsoft-com:vml" xmlns:wp14="http://schemas.microsoft.com/office/word/2010/wordprocessingDrawing" xmlns:wp="http://schemas.openxmlformats.org/drawingml/2006/wordprocessingDrawing" xmlns:w10="urn:schemas-microsoft-com:office:word" xmlns:w="http://schemas.openxmlformats.org/wordprocessingml/2006/main" xmlns:w14="http://schemas.microsoft.com/office/word/2010/wordml" xmlns:wpg="http://schemas.microsoft.com/office/word/2010/wordprocessingGroup" xmlns:wpi="http://schemas.microsoft.com/office/word/2010/wordprocessingInk" xmlns:wne="http://schemas.microsoft.com/office/word/2006/wordml" xmlns:wps="http://schemas.microsoft.com/office/word/2010/wordprocessingShape" xmlns:wpsCustomData="http://www.wps.cn/officeDocument/2013/wpsCustomData" mc:Ignorable="w14 wp14">
   <w:abstractNum w:abstractNumId="0">
+    <w:nsid w:val="88797304"/>
+    <w:multiLevelType w:val="multilevel"/>
+    <w:tmpl w:val="88797304"/>
+    <w:lvl w:ilvl="0" w:tentative="0">
+      <w:start w:val="1"/>
+      <w:numFmt w:val="decimal"/>
+      <w:lvlText w:val="%1."/>
+      <w:lvlJc w:val="left"/>
+      <w:pPr>
+        <w:tabs>
+          <w:tab w:val="left" w:pos="720"/>
+        </w:tabs>
+        <w:ind w:left="720" w:hanging="360"/>
+      </w:pPr>
+      <w:rPr>
+        <w:sz w:val="24"/>
+        <w:szCs w:val="24"/>
+      </w:rPr>
+    </w:lvl>
+    <w:lvl w:ilvl="1" w:tentative="0">
+      <w:start w:val="1"/>
+      <w:numFmt w:val="decimal"/>
+      <w:lvlText w:val="%2."/>
+      <w:lvlJc w:val="left"/>
+      <w:pPr>
+        <w:tabs>
+          <w:tab w:val="left" w:pos="1440"/>
+        </w:tabs>
+        <w:ind w:left="1440" w:hanging="360"/>
+      </w:pPr>
+      <w:rPr>
+        <w:sz w:val="24"/>
+        <w:szCs w:val="24"/>
+      </w:rPr>
+    </w:lvl>
+    <w:lvl w:ilvl="2" w:tentative="0">
+      <w:start w:val="1"/>
+      <w:numFmt w:val="decimal"/>
+      <w:lvlText w:val="%3."/>
+      <w:lvlJc w:val="left"/>
+      <w:pPr>
+        <w:tabs>
+          <w:tab w:val="left" w:pos="2160"/>
+        </w:tabs>
+        <w:ind w:left="2160" w:hanging="360"/>
+      </w:pPr>
+      <w:rPr>
+        <w:sz w:val="24"/>
+        <w:szCs w:val="24"/>
+      </w:rPr>
+    </w:lvl>
+    <w:lvl w:ilvl="3" w:tentative="0">
+      <w:start w:val="1"/>
+      <w:numFmt w:val="decimal"/>
+      <w:lvlText w:val="%4."/>
+      <w:lvlJc w:val="left"/>
+      <w:pPr>
+        <w:tabs>
+          <w:tab w:val="left" w:pos="2517"/>
+        </w:tabs>
+        <w:ind w:left="2880" w:hanging="360"/>
+      </w:pPr>
+      <w:rPr>
+        <w:sz w:val="24"/>
+        <w:szCs w:val="24"/>
+      </w:rPr>
+    </w:lvl>
+    <w:lvl w:ilvl="4" w:tentative="0">
+      <w:start w:val="1"/>
+      <w:numFmt w:val="decimal"/>
+      <w:lvlText w:val="%5."/>
+      <w:lvlJc w:val="left"/>
+      <w:pPr>
+        <w:tabs>
+          <w:tab w:val="left" w:pos="3238"/>
+        </w:tabs>
+        <w:ind w:left="3600" w:hanging="360"/>
+      </w:pPr>
+      <w:rPr>
+        <w:sz w:val="24"/>
+        <w:szCs w:val="24"/>
+      </w:rPr>
+    </w:lvl>
+    <w:lvl w:ilvl="5" w:tentative="0">
+      <w:start w:val="1"/>
+      <w:numFmt w:val="decimal"/>
+      <w:lvlText w:val="%6."/>
+      <w:lvlJc w:val="left"/>
+      <w:pPr>
+        <w:tabs>
+          <w:tab w:val="left" w:pos="3958"/>
+        </w:tabs>
+        <w:ind w:left="4320" w:hanging="360"/>
+      </w:pPr>
+      <w:rPr>
+        <w:sz w:val="24"/>
+        <w:szCs w:val="24"/>
+      </w:rPr>
+    </w:lvl>
+    <w:lvl w:ilvl="6" w:tentative="0">
+      <w:start w:val="1"/>
+      <w:numFmt w:val="decimal"/>
+      <w:lvlText w:val="%7."/>
+      <w:lvlJc w:val="left"/>
+      <w:pPr>
+        <w:tabs>
+          <w:tab w:val="left" w:pos="4678"/>
+        </w:tabs>
+        <w:ind w:left="5040" w:hanging="360"/>
+      </w:pPr>
+      <w:rPr>
+        <w:sz w:val="24"/>
+        <w:szCs w:val="24"/>
+      </w:rPr>
+    </w:lvl>
+    <w:lvl w:ilvl="7" w:tentative="0">
+      <w:start w:val="1"/>
+      <w:numFmt w:val="decimal"/>
+      <w:lvlText w:val="%8."/>
+      <w:lvlJc w:val="left"/>
+      <w:pPr>
+        <w:tabs>
+          <w:tab w:val="left" w:pos="5398"/>
+        </w:tabs>
+        <w:ind w:left="5760" w:hanging="360"/>
+      </w:pPr>
+      <w:rPr>
+        <w:sz w:val="24"/>
+        <w:szCs w:val="24"/>
+      </w:rPr>
+    </w:lvl>
+    <w:lvl w:ilvl="8" w:tentative="0">
+      <w:start w:val="1"/>
+      <w:numFmt w:val="decimal"/>
+      <w:lvlText w:val="%9."/>
+      <w:lvlJc w:val="left"/>
+      <w:pPr>
+        <w:tabs>
+          <w:tab w:val="left" w:pos="6118"/>
+        </w:tabs>
+        <w:ind w:left="6480" w:hanging="360"/>
+      </w:pPr>
+      <w:rPr>
+        <w:sz w:val="24"/>
+        <w:szCs w:val="24"/>
+      </w:rPr>
+    </w:lvl>
+  </w:abstractNum>
+  <w:abstractNum w:abstractNumId="1">
     <w:nsid w:val="9D358507"/>
     <w:multiLevelType w:val="multilevel"/>
     <w:tmpl w:val="9D358507"/>
@@ -33935,7 +34620,7 @@
       </w:rPr>
     </w:lvl>
   </w:abstractNum>
-  <w:abstractNum w:abstractNumId="1">
+  <w:abstractNum w:abstractNumId="2">
     <w:nsid w:val="FFFFFF7E"/>
     <w:multiLevelType w:val="singleLevel"/>
     <w:tmpl w:val="FFFFFF7E"/>
@@ -33953,7 +34638,7 @@
       </w:pPr>
     </w:lvl>
   </w:abstractNum>
-  <w:abstractNum w:abstractNumId="2">
+  <w:abstractNum w:abstractNumId="3">
     <w:nsid w:val="FFFFFF7F"/>
     <w:multiLevelType w:val="singleLevel"/>
     <w:tmpl w:val="FFFFFF7F"/>
@@ -33971,7 +34656,7 @@
       </w:pPr>
     </w:lvl>
   </w:abstractNum>
-  <w:abstractNum w:abstractNumId="3">
+  <w:abstractNum w:abstractNumId="4">
     <w:nsid w:val="FFFFFF82"/>
     <w:multiLevelType w:val="singleLevel"/>
     <w:tmpl w:val="FFFFFF82"/>
@@ -33992,7 +34677,7 @@
       </w:rPr>
     </w:lvl>
   </w:abstractNum>
-  <w:abstractNum w:abstractNumId="4">
+  <w:abstractNum w:abstractNumId="5">
     <w:nsid w:val="FFFFFF83"/>
     <w:multiLevelType w:val="singleLevel"/>
     <w:tmpl w:val="FFFFFF83"/>
@@ -34013,7 +34698,7 @@
       </w:rPr>
     </w:lvl>
   </w:abstractNum>
-  <w:abstractNum w:abstractNumId="5">
+  <w:abstractNum w:abstractNumId="6">
     <w:nsid w:val="FFFFFF88"/>
     <w:multiLevelType w:val="singleLevel"/>
     <w:tmpl w:val="FFFFFF88"/>
@@ -34031,7 +34716,7 @@
       </w:pPr>
     </w:lvl>
   </w:abstractNum>
-  <w:abstractNum w:abstractNumId="6">
+  <w:abstractNum w:abstractNumId="7">
     <w:nsid w:val="FFFFFF89"/>
     <w:multiLevelType w:val="singleLevel"/>
     <w:tmpl w:val="FFFFFF89"/>
@@ -34052,7 +34737,7 @@
       </w:rPr>
     </w:lvl>
   </w:abstractNum>
-  <w:abstractNum w:abstractNumId="7">
+  <w:abstractNum w:abstractNumId="8">
     <w:nsid w:val="31788CD7"/>
     <w:multiLevelType w:val="multilevel"/>
     <w:tmpl w:val="31788CD7"/>
@@ -34201,7 +34886,7 @@
       </w:rPr>
     </w:lvl>
   </w:abstractNum>
-  <w:abstractNum w:abstractNumId="8">
+  <w:abstractNum w:abstractNumId="9">
     <w:nsid w:val="488029EC"/>
     <w:multiLevelType w:val="multilevel"/>
     <w:tmpl w:val="488029EC"/>
@@ -34350,7 +35035,7 @@
       </w:rPr>
     </w:lvl>
   </w:abstractNum>
-  <w:abstractNum w:abstractNumId="9">
+  <w:abstractNum w:abstractNumId="10">
     <w:nsid w:val="64CC9DC4"/>
     <w:multiLevelType w:val="multilevel"/>
     <w:tmpl w:val="64CC9DC4"/>
@@ -34500,34 +35185,37 @@
     </w:lvl>
   </w:abstractNum>
   <w:num w:numId="1">
+    <w:abstractNumId w:val="7"/>
+  </w:num>
+  <w:num w:numId="2">
+    <w:abstractNumId w:val="5"/>
+  </w:num>
+  <w:num w:numId="3">
+    <w:abstractNumId w:val="4"/>
+  </w:num>
+  <w:num w:numId="4">
     <w:abstractNumId w:val="6"/>
   </w:num>
-  <w:num w:numId="2">
-    <w:abstractNumId w:val="4"/>
-  </w:num>
-  <w:num w:numId="3">
+  <w:num w:numId="5">
     <w:abstractNumId w:val="3"/>
   </w:num>
-  <w:num w:numId="4">
-    <w:abstractNumId w:val="5"/>
-  </w:num>
-  <w:num w:numId="5">
+  <w:num w:numId="6">
     <w:abstractNumId w:val="2"/>
   </w:num>
-  <w:num w:numId="6">
+  <w:num w:numId="7">
     <w:abstractNumId w:val="1"/>
   </w:num>
-  <w:num w:numId="7">
-    <w:abstractNumId w:val="0"/>
+  <w:num w:numId="8">
+    <w:abstractNumId w:val="10"/>
   </w:num>
-  <w:num w:numId="8">
+  <w:num w:numId="9">
+    <w:abstractNumId w:val="8"/>
+  </w:num>
+  <w:num w:numId="10">
     <w:abstractNumId w:val="9"/>
   </w:num>
-  <w:num w:numId="9">
-    <w:abstractNumId w:val="7"/>
-  </w:num>
-  <w:num w:numId="10">
-    <w:abstractNumId w:val="8"/>
+  <w:num w:numId="11">
+    <w:abstractNumId w:val="0"/>
   </w:num>
 </w:numbering>
 </file>

</xml_diff>